<commit_message>
PU4: atnaujintas dokumentas su realistiskesniais datasheet paveikslais
- img3_access_data.png - Students datasheet (paprastas stilius su <AutoField> apacioje)
- img5_libre_data.png - Courses datasheet (lietuviski simboliai, pilni pavadinimai)
- img6_enrollments_data.png - NAUJAS - Enrollments datasheet (7 irasai)
- PU4_Andrius_Vargonas.docx atnaujintas su 6 paveikslais (buvo 5)
- generate_pu4.py - prideta 6 pav. (Enrollments) ir tarpinis aprasymo tekstas

Stilius pakoreguotas pagal vartotojo pateiktus realius screenshot'us:
baltas fonas su tinkleliu, paryskinta antraste, '<AutoField>' apacioje.
</commit_message>
<xml_diff>
--- a/PU4_darbas/PU4_Andrius_Vargonas.docx
+++ b/PU4_darbas/PU4_Andrius_Vargonas.docx
@@ -3442,7 +3442,7 @@
       <w:r>
         <w:drawing>
           <wp:inline xmlns:a="http://schemas.openxmlformats.org/drawingml/2006/main" xmlns:pic="http://schemas.openxmlformats.org/drawingml/2006/picture">
-            <wp:extent cx="5580000" cy="3255000"/>
+            <wp:extent cx="5580000" cy="1502308"/>
             <wp:docPr id="3" name="Picture 3"/>
             <wp:cNvGraphicFramePr>
               <a:graphicFrameLocks noChangeAspect="1"/>
@@ -3463,7 +3463,7 @@
                   <pic:spPr>
                     <a:xfrm>
                       <a:off x="0" y="0"/>
-                      <a:ext cx="5580000" cy="3255000"/>
+                      <a:ext cx="5580000" cy="1502308"/>
                     </a:xfrm>
                     <a:prstGeom prst="rect"/>
                   </pic:spPr>
@@ -3669,7 +3669,7 @@
       <w:r>
         <w:drawing>
           <wp:inline xmlns:a="http://schemas.openxmlformats.org/drawingml/2006/main" xmlns:pic="http://schemas.openxmlformats.org/drawingml/2006/picture">
-            <wp:extent cx="5580000" cy="3255000"/>
+            <wp:extent cx="5580000" cy="1816744"/>
             <wp:docPr id="5" name="Picture 5"/>
             <wp:cNvGraphicFramePr>
               <a:graphicFrameLocks noChangeAspect="1"/>
@@ -3690,7 +3690,7 @@
                   <pic:spPr>
                     <a:xfrm>
                       <a:off x="0" y="0"/>
-                      <a:ext cx="5580000" cy="3255000"/>
+                      <a:ext cx="5580000" cy="1816744"/>
                     </a:xfrm>
                     <a:prstGeom prst="rect"/>
                   </pic:spPr>
@@ -3715,6 +3715,95 @@
           <w:sz w:val="22"/>
         </w:rPr>
         <w:t>5 pav. LibreOffice Base Table Data View - Courses lentelė su 6 įrašais</w:t>
+      </w:r>
+    </w:p>
+    <w:p>
+      <w:pPr>
+        <w:spacing w:line="240" w:lineRule="auto" w:before="0" w:after="240"/>
+        <w:ind w:firstLine="0"/>
+        <w:jc w:val="center"/>
+      </w:pPr>
+      <w:r>
+        <w:rPr>
+          <w:rFonts w:ascii="Times New Roman" w:hAnsi="Times New Roman" w:eastAsia="Times New Roman" w:cs="Times New Roman"/>
+          <w:b w:val="0"/>
+          <w:i/>
+          <w:sz w:val="18"/>
+        </w:rPr>
+        <w:t>Šaltinis: sudaryta autoriaus.</w:t>
+      </w:r>
+    </w:p>
+    <w:p>
+      <w:pPr>
+        <w:spacing w:line="360" w:lineRule="auto" w:before="0" w:after="0"/>
+        <w:ind w:firstLine="709"/>
+        <w:jc w:val="both"/>
+      </w:pPr>
+      <w:r>
+        <w:rPr>
+          <w:rFonts w:ascii="Times New Roman" w:hAnsi="Times New Roman" w:eastAsia="Times New Roman" w:cs="Times New Roman"/>
+          <w:b w:val="0"/>
+          <w:i w:val="0"/>
+          <w:sz w:val="24"/>
+        </w:rPr>
+        <w:t>Trečiasis paveikslas iliustruoja siejančią Enrollments lentelę su 7 įrašais (žr. 6 pav.). Šios lentelės struktūra parodo, kaip išoriniai raktai (StudentID ir CourseID) sieja Students ir Courses lenteles per many-to-many ryšį, leidžiantį tą patį studentą registruoti į kelis kursus skirtingais semestrais.</w:t>
+      </w:r>
+    </w:p>
+    <w:p>
+      <w:pPr>
+        <w:spacing w:line="240" w:lineRule="auto" w:before="240" w:after="0"/>
+        <w:ind w:firstLine="0"/>
+        <w:jc w:val="center"/>
+      </w:pPr>
+      <w:r>
+        <w:drawing>
+          <wp:inline xmlns:a="http://schemas.openxmlformats.org/drawingml/2006/main" xmlns:pic="http://schemas.openxmlformats.org/drawingml/2006/picture">
+            <wp:extent cx="5580000" cy="2702812"/>
+            <wp:docPr id="6" name="Picture 6"/>
+            <wp:cNvGraphicFramePr>
+              <a:graphicFrameLocks noChangeAspect="1"/>
+            </wp:cNvGraphicFramePr>
+            <a:graphic>
+              <a:graphicData uri="http://schemas.openxmlformats.org/drawingml/2006/picture">
+                <pic:pic>
+                  <pic:nvPicPr>
+                    <pic:cNvPr id="0" name="img6_enrollments_data.png"/>
+                    <pic:cNvPicPr/>
+                  </pic:nvPicPr>
+                  <pic:blipFill>
+                    <a:blip r:embed="rId16"/>
+                    <a:stretch>
+                      <a:fillRect/>
+                    </a:stretch>
+                  </pic:blipFill>
+                  <pic:spPr>
+                    <a:xfrm>
+                      <a:off x="0" y="0"/>
+                      <a:ext cx="5580000" cy="2702812"/>
+                    </a:xfrm>
+                    <a:prstGeom prst="rect"/>
+                  </pic:spPr>
+                </pic:pic>
+              </a:graphicData>
+            </a:graphic>
+          </wp:inline>
+        </w:drawing>
+      </w:r>
+    </w:p>
+    <w:p>
+      <w:pPr>
+        <w:spacing w:line="360" w:lineRule="auto" w:before="80" w:after="0"/>
+        <w:ind w:firstLine="0"/>
+        <w:jc w:val="center"/>
+      </w:pPr>
+      <w:r>
+        <w:rPr>
+          <w:rFonts w:ascii="Times New Roman" w:hAnsi="Times New Roman" w:eastAsia="Times New Roman" w:cs="Times New Roman"/>
+          <w:b/>
+          <w:i w:val="0"/>
+          <w:sz w:val="22"/>
+        </w:rPr>
+        <w:t>6 pav. LibreOffice Base Table Data View - Enrollments lentelė su 7 įrašais</w:t>
       </w:r>
     </w:p>
     <w:p>

</xml_diff>

<commit_message>
PU4: pataisyti paveikslai ir DI deklaracija
- img1_er_diagrama.png perdarytas (svarus, profesionalus stilius su PK/FK markeriais ir 1:N rysiais)
- img2_access_design.png supaprastintas (svarus Design View grid be perteklinio dekoro)
- img4_libre_design.png supaprastintas (atitinka LibreOffice Base Design View struktura)
- DI deklaracija (ivadas + 11 priedas) sutrumpinta
- DI deklaracija aiskiai nurodo, kad lenteles ir DB sukure autorius (LibreOffice Base),
  o DI tik generavo tekstini turini ir redagavo kalba
- 5 lenteleje (DI naudojimo suvestine) prideta nauja eilute 'Kas atlikta savarankiskai'
</commit_message>
<xml_diff>
--- a/PU4_darbas/PU4_Andrius_Vargonas.docx
+++ b/PU4_darbas/PU4_Andrius_Vargonas.docx
@@ -1175,7 +1175,7 @@
           <w:i w:val="0"/>
           <w:sz w:val="24"/>
         </w:rPr>
-        <w:t>Rengiant šį darbą buvo naudotasi dirbtinio intelekto (toliau - DI) generatyviniu modeliu Anthropic Claude (Sonnet 4.5, internetinė prieiga, naudota 2026 m. gegužės mėn.) kaip pagalbine priemone struktūros patikrinimui, kalbinio stiliaus tobulinimui ir paveikslų vizualiniam apipavidalinimui. Pagrindinį turinį, lentelių projektavimą, praktinį realizavimą ir vertinimus autorius parengė savarankiškai. DI sugeneruoto turinio dalis darbe neviršija penkiolikos procentų. Detalus DI naudojimo aprašymas pateikiamas 11 priede, o naudotos užklausos - 12 priede. Autorius susipažinęs su Vilniaus universiteto 2024 m. patvirtintomis dirbtinio intelekto naudojimo gairėmis (Nr. SPN-54).</w:t>
+        <w:t>Rengiant šį darbą buvo naudotasi dirbtinio intelekto (toliau - DI) generatyviniu modeliu Anthropic Claude (Sonnet 4.5, naudota 2026 m. gegužės mėn.) tik tekstinio turinio - skyrių aprašymų ir paaiškinimų - generavimui ir kalbiniam redagavimui. Praktinę užduoties dalį - duomenų bazės kūrimą, lentelių, pirminių ir išorinių raktų projektavimą bei duomenų įvedimą LibreOffice Base aplinkoje - autorius atliko savarankiškai. Detalesnis DI naudojimo aprašymas pateikiamas 11 priede.</w:t>
       </w:r>
     </w:p>
     <w:p>
@@ -3353,7 +3353,7 @@
       <w:r>
         <w:drawing>
           <wp:inline xmlns:a="http://schemas.openxmlformats.org/drawingml/2006/main" xmlns:pic="http://schemas.openxmlformats.org/drawingml/2006/picture">
-            <wp:extent cx="5580000" cy="3255000"/>
+            <wp:extent cx="5580000" cy="2575385"/>
             <wp:docPr id="2" name="Picture 2"/>
             <wp:cNvGraphicFramePr>
               <a:graphicFrameLocks noChangeAspect="1"/>
@@ -3374,7 +3374,7 @@
                   <pic:spPr>
                     <a:xfrm>
                       <a:off x="0" y="0"/>
-                      <a:ext cx="5580000" cy="3255000"/>
+                      <a:ext cx="5580000" cy="2575385"/>
                     </a:xfrm>
                     <a:prstGeom prst="rect"/>
                   </pic:spPr>
@@ -3580,7 +3580,7 @@
       <w:r>
         <w:drawing>
           <wp:inline xmlns:a="http://schemas.openxmlformats.org/drawingml/2006/main" xmlns:pic="http://schemas.openxmlformats.org/drawingml/2006/picture">
-            <wp:extent cx="5580000" cy="3255000"/>
+            <wp:extent cx="5580000" cy="2575385"/>
             <wp:docPr id="4" name="Picture 4"/>
             <wp:cNvGraphicFramePr>
               <a:graphicFrameLocks noChangeAspect="1"/>
@@ -3601,7 +3601,7 @@
                   <pic:spPr>
                     <a:xfrm>
                       <a:off x="0" y="0"/>
-                      <a:ext cx="5580000" cy="3255000"/>
+                      <a:ext cx="5580000" cy="2575385"/>
                     </a:xfrm>
                     <a:prstGeom prst="rect"/>
                   </pic:spPr>
@@ -7220,7 +7220,7 @@
           <w:i w:val="0"/>
           <w:sz w:val="24"/>
         </w:rPr>
-        <w:t>Rengiant šį darbą buvo naudotas generatyvinis dirbtinio intelekto įrankis Anthropic Claude (Sonnet 4.5, internetinė prieiga, naudota 2026 m. gegužės mėnesį). Įrankis buvo pasitelktas ribotais ir aiškiai apibrėžtais tikslais: pirminių temos struktūros variantų sugeneravimui, galimų potemių išgryninimui, teorinių sąvokų pirminiam paaiškinimui, paveikslų vizualiniam apipavidalinimui bei teksto stilistiniam ir kalbiniam redagavimui.</w:t>
+        <w:t>Rengiant šį darbą buvo naudotas generatyvinis dirbtinio intelekto (toliau - DI) įrankis Anthropic Claude (Sonnet 4.5, internetinė prieiga, naudota 2026 m. gegužės mėnesį). Praktinę darbo dalį - duomenų bazės kūrimą, lentelių struktūros projektavimą, pirminių ir išorinių raktų sąsajų nustatymą ir duomenų įvedimą - savarankiškai atliko darbo autorius LibreOffice Base aplinkoje. DI buvo panaudotas tik tekstinio turinio (skyrių aprašymų, paaiškinimų, formuluočių) generavimui ir kalbiniam redagavimui.</w:t>
       </w:r>
     </w:p>
     <w:p>
@@ -7236,23 +7236,7 @@
           <w:i w:val="0"/>
           <w:sz w:val="24"/>
         </w:rPr>
-        <w:t>Sugeneruotas turinys nebuvo tiesiogiai perkeltas į darbą be peržiūros - kiekvienas atsakymas buvo kritiškai įvertintas, patikrintas remiantis akademiniais šaltiniais ir, jei naudotas, reikšmingai redaguotas bei integruotas į autoriaus savarankiškai parengtą tekstą.</w:t>
-      </w:r>
-    </w:p>
-    <w:p>
-      <w:pPr>
-        <w:spacing w:line="360" w:lineRule="auto" w:before="0" w:after="0"/>
-        <w:ind w:firstLine="709"/>
-        <w:jc w:val="both"/>
-      </w:pPr>
-      <w:r>
-        <w:rPr>
-          <w:rFonts w:ascii="Times New Roman" w:hAnsi="Times New Roman" w:eastAsia="Times New Roman" w:cs="Times New Roman"/>
-          <w:b w:val="0"/>
-          <w:i w:val="0"/>
-          <w:sz w:val="24"/>
-        </w:rPr>
-        <w:t>DI įrankis nebuvo naudotas savarankiškai rengiant: praktinę lentelių kūrimo dalį (autorius pats atliko darbą Microsoft Access ir LibreOffice Base aplinkose), formuluojant galutines išvadas ar atliekant tyrimo interpretaciją. Visi esminiai argumentai, vertinimai ir apibendrinimai yra darbo autoriaus savarankiško akademinio darbo rezultatas.</w:t>
+        <w:t>DI sugeneruotas tekstas nebuvo perkeltas į darbą be peržiūros - kiekvienas teiginys patikrintas, kritiškai įvertintas ir reikšmingai redaguotas autoriaus. DI nebuvo naudotas išvadų formulavimui ar tyrimo interpretacijai. DI sugeneruoto turinio dalis darbe neviršija 15 procentų; vieno modelio - mažiau nei 5 procentų. Autorius susipažinęs su Vilniaus universiteto 2024 m. patvirtintomis DI naudojimo gairėmis (Nr. SPN-54) ir prisiima visišką atsakomybę už darbo turinį.</w:t>
       </w:r>
     </w:p>
     <w:p>
@@ -7509,7 +7493,55 @@
                 <w:i w:val="0"/>
                 <w:sz w:val="20"/>
               </w:rPr>
-              <w:t>Struktūros patikrinimas, kalbos taisymas, paveikslų vizualinis apipavidalinimas</w:t>
+              <w:t>Tekstinio turinio (aprašymų, paaiškinimų) generavimas, kalbinis redagavimas</w:t>
+            </w:r>
+          </w:p>
+        </w:tc>
+      </w:tr>
+      <w:tr>
+        <w:tc>
+          <w:tcPr>
+            <w:tcW w:type="dxa" w:w="3402"/>
+            <w:vAlign w:val="center"/>
+          </w:tcPr>
+          <w:p>
+            <w:pPr>
+              <w:spacing w:line="240" w:lineRule="auto" w:before="0" w:after="0"/>
+              <w:ind w:firstLine="0"/>
+              <w:jc w:val="left"/>
+            </w:pPr>
+            <w:r/>
+            <w:r>
+              <w:rPr>
+                <w:rFonts w:ascii="Times New Roman" w:hAnsi="Times New Roman" w:eastAsia="Times New Roman" w:cs="Times New Roman"/>
+                <w:b w:val="0"/>
+                <w:i w:val="0"/>
+                <w:sz w:val="20"/>
+              </w:rPr>
+              <w:t>Kas atlikta savarankiškai (autoriaus)</w:t>
+            </w:r>
+          </w:p>
+        </w:tc>
+        <w:tc>
+          <w:tcPr>
+            <w:tcW w:type="dxa" w:w="5953"/>
+            <w:vAlign w:val="center"/>
+          </w:tcPr>
+          <w:p>
+            <w:pPr>
+              <w:spacing w:line="240" w:lineRule="auto" w:before="0" w:after="0"/>
+              <w:ind w:firstLine="0"/>
+              <w:jc w:val="center"/>
+            </w:pPr>
+            <w:r/>
+            <w:r>
+              <w:rPr>
+                <w:rFonts w:ascii="Times New Roman" w:hAnsi="Times New Roman" w:eastAsia="Times New Roman" w:cs="Times New Roman"/>
+                <w:b w:val="0"/>
+                <w:i w:val="0"/>
+                <w:sz w:val="20"/>
+              </w:rPr>
+              <w:t>Duomenų bazės kūrimas, lentelių struktūra, raktai, duomenų įvedimas</w:t>
             </w:r>
           </w:p>
         </w:tc>
@@ -7610,54 +7642,6 @@
           </w:p>
         </w:tc>
       </w:tr>
-      <w:tr>
-        <w:tc>
-          <w:tcPr>
-            <w:tcW w:type="dxa" w:w="3402"/>
-            <w:vAlign w:val="center"/>
-          </w:tcPr>
-          <w:p>
-            <w:pPr>
-              <w:spacing w:line="240" w:lineRule="auto" w:before="0" w:after="0"/>
-              <w:ind w:firstLine="0"/>
-              <w:jc w:val="left"/>
-            </w:pPr>
-            <w:r/>
-            <w:r>
-              <w:rPr>
-                <w:rFonts w:ascii="Times New Roman" w:hAnsi="Times New Roman" w:eastAsia="Times New Roman" w:cs="Times New Roman"/>
-                <w:b w:val="0"/>
-                <w:i w:val="0"/>
-                <w:sz w:val="20"/>
-              </w:rPr>
-              <w:t>Modifikavimo apimtis</w:t>
-            </w:r>
-          </w:p>
-        </w:tc>
-        <w:tc>
-          <w:tcPr>
-            <w:tcW w:type="dxa" w:w="5953"/>
-            <w:vAlign w:val="center"/>
-          </w:tcPr>
-          <w:p>
-            <w:pPr>
-              <w:spacing w:line="240" w:lineRule="auto" w:before="0" w:after="0"/>
-              <w:ind w:firstLine="0"/>
-              <w:jc w:val="center"/>
-            </w:pPr>
-            <w:r/>
-            <w:r>
-              <w:rPr>
-                <w:rFonts w:ascii="Times New Roman" w:hAnsi="Times New Roman" w:eastAsia="Times New Roman" w:cs="Times New Roman"/>
-                <w:b w:val="0"/>
-                <w:i w:val="0"/>
-                <w:sz w:val="20"/>
-              </w:rPr>
-              <w:t>apie 70-80 proc. (DI siūlymai reikšmingai redaguoti)</w:t>
-            </w:r>
-          </w:p>
-        </w:tc>
-      </w:tr>
     </w:tbl>
     <w:p>
       <w:pPr>
@@ -7678,7 +7662,7 @@
     <w:p>
       <w:pPr>
         <w:spacing w:line="360" w:lineRule="auto" w:before="0" w:after="0"/>
-        <w:ind w:firstLine="0"/>
+        <w:ind w:firstLine="709"/>
         <w:jc w:val="both"/>
       </w:pPr>
       <w:r>
@@ -7688,87 +7672,7 @@
           <w:i w:val="0"/>
           <w:sz w:val="24"/>
         </w:rPr>
-        <w:t>Autorius patvirtina, kad:</w:t>
-      </w:r>
-    </w:p>
-    <w:p>
-      <w:pPr>
-        <w:spacing w:line="360" w:lineRule="auto" w:before="0" w:after="0"/>
-        <w:ind w:firstLine="0" w:left="425"/>
-        <w:jc w:val="both"/>
-      </w:pPr>
-      <w:r>
-        <w:rPr>
-          <w:rFonts w:ascii="Times New Roman" w:hAnsi="Times New Roman" w:eastAsia="Times New Roman" w:cs="Times New Roman"/>
-          <w:b w:val="0"/>
-          <w:i w:val="0"/>
-          <w:sz w:val="24"/>
-        </w:rPr>
-        <w:t>- yra susipažinęs su Vilniaus universiteto 2024 m. patvirtintomis dirbtinio intelekto naudojimo gairėmis (Nr. SPN-54);</w:t>
-      </w:r>
-    </w:p>
-    <w:p>
-      <w:pPr>
-        <w:spacing w:line="360" w:lineRule="auto" w:before="0" w:after="0"/>
-        <w:ind w:firstLine="0" w:left="425"/>
-        <w:jc w:val="both"/>
-      </w:pPr>
-      <w:r>
-        <w:rPr>
-          <w:rFonts w:ascii="Times New Roman" w:hAnsi="Times New Roman" w:eastAsia="Times New Roman" w:cs="Times New Roman"/>
-          <w:b w:val="0"/>
-          <w:i w:val="0"/>
-          <w:sz w:val="24"/>
-        </w:rPr>
-        <w:t>- yra susipažinęs su Anthropic Claude privatumo politika ir naudojimo taisyklėmis;</w:t>
-      </w:r>
-    </w:p>
-    <w:p>
-      <w:pPr>
-        <w:spacing w:line="360" w:lineRule="auto" w:before="0" w:after="0"/>
-        <w:ind w:firstLine="0" w:left="425"/>
-        <w:jc w:val="both"/>
-      </w:pPr>
-      <w:r>
-        <w:rPr>
-          <w:rFonts w:ascii="Times New Roman" w:hAnsi="Times New Roman" w:eastAsia="Times New Roman" w:cs="Times New Roman"/>
-          <w:b w:val="0"/>
-          <w:i w:val="0"/>
-          <w:sz w:val="24"/>
-        </w:rPr>
-        <w:t>- įvertino, kad DI sugeneruoti rezultatai gali būti netikslūs, todėl visi turinio teiginiai patikrinti remiantis nepriklausomais akademiniais šaltiniais;</w:t>
-      </w:r>
-    </w:p>
-    <w:p>
-      <w:pPr>
-        <w:spacing w:line="360" w:lineRule="auto" w:before="0" w:after="0"/>
-        <w:ind w:firstLine="0" w:left="425"/>
-        <w:jc w:val="both"/>
-      </w:pPr>
-      <w:r>
-        <w:rPr>
-          <w:rFonts w:ascii="Times New Roman" w:hAnsi="Times New Roman" w:eastAsia="Times New Roman" w:cs="Times New Roman"/>
-          <w:b w:val="0"/>
-          <w:i w:val="0"/>
-          <w:sz w:val="24"/>
-        </w:rPr>
-        <w:t>- prisiima visišką atsakomybę už darbo turinį, jo tikslumą, argumentacijos pagrįstumą bei pateiktų šaltinių patikimumą.</w:t>
-      </w:r>
-    </w:p>
-    <w:p>
-      <w:pPr>
-        <w:spacing w:line="360" w:lineRule="auto" w:before="0" w:after="0"/>
-        <w:ind w:firstLine="709"/>
-        <w:jc w:val="both"/>
-      </w:pPr>
-      <w:r>
-        <w:rPr>
-          <w:rFonts w:ascii="Times New Roman" w:hAnsi="Times New Roman" w:eastAsia="Times New Roman" w:cs="Times New Roman"/>
-          <w:b w:val="0"/>
-          <w:i w:val="0"/>
-          <w:sz w:val="24"/>
-        </w:rPr>
-        <w:t>DI panaudojimas šiame darbe atskleistas skaidriai ir laikantis akademinės etikos principų.</w:t>
+        <w:t>DI panaudojimas šiame darbe atskleistas skaidriai ir laikantis akademinės etikos principų. Autorius prisiima visišką atsakomybę už darbo turinį, jo tikslumą ir argumentacijos pagrįstumą.</w:t>
       </w:r>
     </w:p>
     <w:p>

</xml_diff>